<commit_message>
Correção das horas + deslocações
</commit_message>
<xml_diff>
--- a/Invoice(Fatura)_Teiker.docx
+++ b/Invoice(Fatura)_Teiker.docx
@@ -104,75 +104,7 @@
             <w:tcW w:w="6757" w:type="dxa"/>
             <w:gridSpan w:val="2"/>
           </w:tcPr>
-          <w:p>
-            <w:pPr>
-              <w:pStyle w:val="Ttulo1"/>
-              <w:rPr>
-                <w:rFonts w:ascii="Microsoft Sans Serif" w:hAnsi="Microsoft Sans Serif" w:cs="Microsoft Sans Serif"/>
-                <w:color w:val="284434"/>
-              </w:rPr>
-            </w:pPr>
-            <w:r>
-              <w:rPr>
-                <w:rFonts w:ascii="Microsoft Sans Serif" w:hAnsi="Microsoft Sans Serif" w:cs="Microsoft Sans Serif"/>
-                <w:color w:val="284434"/>
-              </w:rPr>
-              <w:t xml:space="preserve">                                            </w:t>
-            </w:r>
-            <w:r>
-              <w:rPr>
-                <w:rFonts w:ascii="Microsoft Sans Serif" w:hAnsi="Microsoft Sans Serif" w:cs="Microsoft Sans Serif"/>
-                <w:color w:val="284434"/>
-              </w:rPr>
-              <w:fldChar w:fldCharType="begin">
-                <w:ffData>
-                  <w:name w:val="qr_code"/>
-                  <w:enabled/>
-                  <w:calcOnExit w:val="0"/>
-                  <w:textInput>
-                    <w:default w:val="qr_code"/>
-                  </w:textInput>
-                </w:ffData>
-              </w:fldChar>
-            </w:r>
-            <w:bookmarkStart w:id="0" w:name="qr_code"/>
-            <w:r>
-              <w:rPr>
-                <w:rFonts w:ascii="Microsoft Sans Serif" w:hAnsi="Microsoft Sans Serif" w:cs="Microsoft Sans Serif"/>
-                <w:color w:val="284434"/>
-              </w:rPr>
-              <w:instrText xml:space="preserve"> FORMTEXT </w:instrText>
-            </w:r>
-            <w:r>
-              <w:rPr>
-                <w:rFonts w:ascii="Microsoft Sans Serif" w:hAnsi="Microsoft Sans Serif" w:cs="Microsoft Sans Serif"/>
-                <w:color w:val="284434"/>
-              </w:rPr>
-            </w:r>
-            <w:r>
-              <w:rPr>
-                <w:rFonts w:ascii="Microsoft Sans Serif" w:hAnsi="Microsoft Sans Serif" w:cs="Microsoft Sans Serif"/>
-                <w:color w:val="284434"/>
-              </w:rPr>
-              <w:fldChar w:fldCharType="separate"/>
-            </w:r>
-            <w:r>
-              <w:rPr>
-                <w:rFonts w:ascii="Microsoft Sans Serif" w:hAnsi="Microsoft Sans Serif" w:cs="Microsoft Sans Serif"/>
-                <w:noProof/>
-                <w:color w:val="284434"/>
-              </w:rPr>
-              <w:t>qr_code</w:t>
-            </w:r>
-            <w:r>
-              <w:rPr>
-                <w:rFonts w:ascii="Microsoft Sans Serif" w:hAnsi="Microsoft Sans Serif" w:cs="Microsoft Sans Serif"/>
-                <w:color w:val="284434"/>
-              </w:rPr>
-              <w:fldChar w:fldCharType="end"/>
-            </w:r>
-            <w:bookmarkEnd w:id="0"/>
-          </w:p>
+          <w:p/>
         </w:tc>
       </w:tr>
       <w:tr>

</xml_diff>